<commit_message>
add new feature in analysis 6
</commit_message>
<xml_diff>
--- a/backend/docs/KARTA_CAM_MAHINDRA_20260328.docx
+++ b/backend/docs/KARTA_CAM_MAHINDRA_20260328.docx
@@ -341,7 +341,7 @@
         <w:pStyle w:val="Heading2"/>
       </w:pPr>
       <w:r>
-        <w:t>Name: [Guarantor Name]</w:t>
+        <w:t>- Name: [Guarantor Name]</w:t>
       </w:r>
     </w:p>
     <w:p>
@@ -349,7 +349,7 @@
         <w:pStyle w:val="Heading2"/>
       </w:pPr>
       <w:r>
-        <w:t>Address: [Guarantor Address]</w:t>
+        <w:t>- Address: [Guarantor Address]</w:t>
       </w:r>
     </w:p>
     <w:p>
@@ -357,7 +357,7 @@
         <w:pStyle w:val="Heading2"/>
       </w:pPr>
       <w:r>
-        <w:t>CIBIL Score: [CIBIL Score]</w:t>
+        <w:t>- CIBIL Score: [CIBIL Score]</w:t>
       </w:r>
     </w:p>
     <w:p>
@@ -365,7 +365,7 @@
         <w:pStyle w:val="Heading2"/>
       </w:pPr>
       <w:r>
-        <w:t>Incomes: [Income Details]</w:t>
+        <w:t>- Incomes: [Income Details]</w:t>
       </w:r>
     </w:p>
     <w:p>
@@ -380,7 +380,7 @@
     </w:p>
     <w:p>
       <w:r>
-        <w:t>[Reference Check Details for Machine Supplier]</w:t>
+        <w:t>[Machine Supplier Reference Check]</w:t>
       </w:r>
     </w:p>
     <w:p>
@@ -390,7 +390,7 @@
     </w:p>
     <w:p>
       <w:r>
-        <w:t>[Reference Check Details for Creditor]</w:t>
+        <w:t>[Creditor Reference Check]</w:t>
       </w:r>
     </w:p>
     <w:p>
@@ -400,7 +400,7 @@
     </w:p>
     <w:p>
       <w:r>
-        <w:t>[Reference Check Details for Customer]</w:t>
+        <w:t>[Customer Reference Check]</w:t>
       </w:r>
     </w:p>
     <w:p>
@@ -410,7 +410,7 @@
     </w:p>
     <w:p>
       <w:r>
-        <w:t>[Reference Check Details for Bankers/Term Lenders]</w:t>
+        <w:t>[Bankers/Term Lenders Reference Check]</w:t>
       </w:r>
     </w:p>
     <w:p>
@@ -420,52 +420,17 @@
     </w:p>
     <w:p>
       <w:r>
-        <w:t>[Reference Check Details for Competitors/Peers]</w:t>
+        <w:t>[Competitors/Peers Reference Check]</w:t>
       </w:r>
     </w:p>
     <w:p>
       <w:r>
-        <w:t>4. Compliances &amp; Legal</w:t>
+        <w:t>4. COMPLIANCES &amp; LEGAL</w:t>
       </w:r>
     </w:p>
     <w:p>
       <w:r>
-        <w:t>| Compliance Check | Status |</w:t>
-      </w:r>
-    </w:p>
-    <w:p>
-      <w:r>
-        <w:t>| --- | --- |</w:t>
-      </w:r>
-    </w:p>
-    <w:p>
-      <w:r>
-        <w:t>| Income Tax Filing | [Income Tax Compliance Status] |</w:t>
-      </w:r>
-    </w:p>
-    <w:p>
-      <w:r>
-        <w:t>| Excise Duty | [Excise Duty Compliance Status] |</w:t>
-      </w:r>
-    </w:p>
-    <w:p>
-      <w:r>
-        <w:t>| Sales Tax | [Sales Tax Compliance Status] |</w:t>
-      </w:r>
-    </w:p>
-    <w:p>
-      <w:r>
-        <w:t>| ESIC/EPF | [ESIC/EPF Compliance Status] |</w:t>
-      </w:r>
-    </w:p>
-    <w:p>
-      <w:r>
-        <w:t>| Litigations | [Litigation Status] |</w:t>
-      </w:r>
-    </w:p>
-    <w:p>
-      <w:r>
-        <w:t>| Defaults | [Default Status] |</w:t>
+        <w:t>The company's compliance with various regulations is as follows:</w:t>
       </w:r>
     </w:p>
     <w:p>
@@ -658,7 +623,7 @@
     </w:p>
     <w:p>
       <w:r>
-        <w:t>[CAT Sheet Details]</w:t>
+        <w:t>[Cat Sheet Details]</w:t>
       </w:r>
     </w:p>
     <w:p>
@@ -1056,7 +1021,7 @@
           </w:tcPr>
           <w:p>
             <w:r>
-              <w:t>2999999.0</w:t>
+              <w:t>3000000.0</w:t>
             </w:r>
           </w:p>
         </w:tc>
@@ -1076,7 +1041,7 @@
           </w:tcPr>
           <w:p>
             <w:r>
-              <w:t>2999999.0</w:t>
+              <w:t>3000000.0</w:t>
             </w:r>
           </w:p>
         </w:tc>
@@ -1225,12 +1190,12 @@
     </w:p>
     <w:p>
       <w:r>
-        <w:t>1. Enhanced Due Diligence Required: Submit Big-4 audited financials for the last 3 years. Resolve GST ITC mismatch of ₹59.7 Lakhs before disbursement.</w:t>
+        <w:t>1. Enhanced Due Diligence Required: Submit Big-4 audited financials for the last 3 years. Resolve the GST ITC mismatch of ₹59.7 Lakhs before disbursement.</w:t>
       </w:r>
     </w:p>
     <w:p>
       <w:r>
-        <w:t>2. Additional Collateral Required: Collateral coverage ratio minimum 1.5x of loan amount. Current gap estimated at ₹15.0 Lakhs based on PD of 52.4%.</w:t>
+        <w:t>2. Additional Collateral Required: Collateral coverage ratio must be a minimum of 1.5x of the loan amount. Based on the PD of 52.4%, there is an estimated gap of ₹15.0 Lakhs.</w:t>
       </w:r>
     </w:p>
     <w:sectPr>

</xml_diff>

<commit_message>
add new feature in analysis 7
</commit_message>
<xml_diff>
--- a/backend/docs/KARTA_CAM_MAHINDRA_20260328.docx
+++ b/backend/docs/KARTA_CAM_MAHINDRA_20260328.docx
@@ -341,7 +341,7 @@
         <w:pStyle w:val="Heading2"/>
       </w:pPr>
       <w:r>
-        <w:t>- Name: [Guarantor Name]</w:t>
+        <w:t>Name: [Guarantor Name]</w:t>
       </w:r>
     </w:p>
     <w:p>
@@ -349,7 +349,7 @@
         <w:pStyle w:val="Heading2"/>
       </w:pPr>
       <w:r>
-        <w:t>- Address: [Guarantor Address]</w:t>
+        <w:t>Address: [Guarantor Address]</w:t>
       </w:r>
     </w:p>
     <w:p>
@@ -357,7 +357,7 @@
         <w:pStyle w:val="Heading2"/>
       </w:pPr>
       <w:r>
-        <w:t>- CIBIL Score: [CIBIL Score]</w:t>
+        <w:t>CIBIL Score: [CIBIL Score]</w:t>
       </w:r>
     </w:p>
     <w:p>
@@ -365,7 +365,7 @@
         <w:pStyle w:val="Heading2"/>
       </w:pPr>
       <w:r>
-        <w:t>- Incomes: [Income Details]</w:t>
+        <w:t>Incomes: [Income Details]</w:t>
       </w:r>
     </w:p>
     <w:p>
@@ -380,7 +380,7 @@
     </w:p>
     <w:p>
       <w:r>
-        <w:t>[Machine Supplier Reference Check]</w:t>
+        <w:t>[Machine Supplier Reference]</w:t>
       </w:r>
     </w:p>
     <w:p>
@@ -390,7 +390,7 @@
     </w:p>
     <w:p>
       <w:r>
-        <w:t>[Creditor Reference Check]</w:t>
+        <w:t>[Creditor Reference]</w:t>
       </w:r>
     </w:p>
     <w:p>
@@ -400,7 +400,7 @@
     </w:p>
     <w:p>
       <w:r>
-        <w:t>[Customer Reference Check]</w:t>
+        <w:t>[Customer Reference]</w:t>
       </w:r>
     </w:p>
     <w:p>
@@ -410,7 +410,7 @@
     </w:p>
     <w:p>
       <w:r>
-        <w:t>[Bankers/Term Lenders Reference Check]</w:t>
+        <w:t>[Bankers/Term Lenders Reference]</w:t>
       </w:r>
     </w:p>
     <w:p>
@@ -420,17 +420,12 @@
     </w:p>
     <w:p>
       <w:r>
-        <w:t>[Competitors/Peers Reference Check]</w:t>
+        <w:t>[Competitors/Peers Reference]</w:t>
       </w:r>
     </w:p>
     <w:p>
       <w:r>
-        <w:t>4. COMPLIANCES &amp; LEGAL</w:t>
-      </w:r>
-    </w:p>
-    <w:p>
-      <w:r>
-        <w:t>The company's compliance with various regulations is as follows:</w:t>
+        <w:t>4. Compliances &amp; Legal</w:t>
       </w:r>
     </w:p>
     <w:p>
@@ -623,7 +618,7 @@
     </w:p>
     <w:p>
       <w:r>
-        <w:t>[Cat Sheet Details]</w:t>
+        <w:t>[CAT SHEET DETAILS]</w:t>
       </w:r>
     </w:p>
     <w:p>
@@ -633,7 +628,7 @@
     </w:p>
     <w:p>
       <w:r>
-        <w:t>[Corporate Guarantor Details]</w:t>
+        <w:t>[CORPORATE GUARANTOR DETAILS]</w:t>
       </w:r>
     </w:p>
     <w:p>
@@ -1180,7 +1175,7 @@
     </w:p>
     <w:p>
       <w:r>
-        <w:t>[Visit Report Details]</w:t>
+        <w:t>[VISIT REPORT DETAILS]</w:t>
       </w:r>
     </w:p>
     <w:p>
@@ -1195,7 +1190,7 @@
     </w:p>
     <w:p>
       <w:r>
-        <w:t>2. Additional Collateral Required: Collateral coverage ratio must be a minimum of 1.5x of the loan amount. Based on the PD of 52.4%, there is an estimated gap of ₹15.0 Lakhs.</w:t>
+        <w:t>2. Additional Collateral Required: Collateral coverage ratio must be a minimum of 1.5x of the loan amount. Based on the probability of default (PD) of 52.4%, the current gap is estimated at ₹15.0 Lakhs.</w:t>
       </w:r>
     </w:p>
     <w:sectPr>

</xml_diff>

<commit_message>
add new feature in analysis 9
</commit_message>
<xml_diff>
--- a/backend/docs/KARTA_CAM_MAHINDRA_20260328.docx
+++ b/backend/docs/KARTA_CAM_MAHINDRA_20260328.docx
@@ -49,10 +49,10 @@
       <w:r>
         <w:rPr>
           <w:b/>
-          <w:color w:val="FF0000"/>
+          <w:color w:val="FF8C00"/>
           <w:sz w:val="48"/>
         </w:rPr>
-        <w:t>REJECT</w:t>
+        <w:t>CONDITIONAL</w:t>
       </w:r>
     </w:p>
     <w:p>
@@ -333,6 +333,47 @@
     </w:tbl>
     <w:p>
       <w:r>
+        <w:t>- Residence: Verified through Aadhaar and Voter ID.</w:t>
+      </w:r>
+    </w:p>
+    <w:p>
+      <w:r>
+        <w:t>- Machine Supplier: Verified through GST and PAN details.</w:t>
+      </w:r>
+    </w:p>
+    <w:p>
+      <w:r>
+        <w:t>- Bankers: Account statements from Kotak Mahindra Bank and ICICI Bank were provided for verification.</w:t>
+      </w:r>
+    </w:p>
+    <w:p>
+      <w:pPr>
+        <w:pStyle w:val="Heading2"/>
+      </w:pPr>
+      <w:r>
+        <w:t>- Creditors: No creditors were disclosed.</w:t>
+      </w:r>
+    </w:p>
+    <w:p>
+      <w:r>
+        <w:t>- Independent/Market: No independent verification was conducted.</w:t>
+      </w:r>
+    </w:p>
+    <w:p>
+      <w:pPr>
+        <w:pStyle w:val="Heading2"/>
+      </w:pPr>
+      <w:r>
+        <w:t>- Dedupe: No duplicate entities were found.</w:t>
+      </w:r>
+    </w:p>
+    <w:p>
+      <w:r>
+        <w:t>- FCU Check: No FCU records were found for the company.</w:t>
+      </w:r>
+    </w:p>
+    <w:p>
+      <w:r>
         <w:t>2. GUARANTOR DETAIL</w:t>
       </w:r>
     </w:p>
@@ -341,7 +382,7 @@
         <w:pStyle w:val="Heading2"/>
       </w:pPr>
       <w:r>
-        <w:t>Name: [Guarantor Name]</w:t>
+        <w:t>- Name: Not provided.</w:t>
       </w:r>
     </w:p>
     <w:p>
@@ -349,7 +390,7 @@
         <w:pStyle w:val="Heading2"/>
       </w:pPr>
       <w:r>
-        <w:t>Address: [Guarantor Address]</w:t>
+        <w:t>- Address: Not provided.</w:t>
       </w:r>
     </w:p>
     <w:p>
@@ -357,7 +398,7 @@
         <w:pStyle w:val="Heading2"/>
       </w:pPr>
       <w:r>
-        <w:t>CIBIL Score: [CIBIL Score]</w:t>
+        <w:t>- CIBIL Score: Not provided.</w:t>
       </w:r>
     </w:p>
     <w:p>
@@ -365,7 +406,7 @@
         <w:pStyle w:val="Heading2"/>
       </w:pPr>
       <w:r>
-        <w:t>Incomes: [Income Details]</w:t>
+        <w:t>- Incomes: Not provided.</w:t>
       </w:r>
     </w:p>
     <w:p>
@@ -375,57 +416,32 @@
     </w:p>
     <w:p>
       <w:r>
-        <w:t>Machine Supplier</w:t>
+        <w:t>- Machine Supplier: The machine supplier's details were verified through GST and PAN records. No further reference checks were conducted.</w:t>
       </w:r>
     </w:p>
     <w:p>
       <w:r>
-        <w:t>[Machine Supplier Reference]</w:t>
+        <w:t>- Creditor: No creditors were disclosed, hence no reference checks were possible.</w:t>
       </w:r>
     </w:p>
     <w:p>
       <w:r>
-        <w:t>Creditor</w:t>
+        <w:t>- Customer: The customer's details were not provided, hence no reference checks were conducted.</w:t>
       </w:r>
     </w:p>
     <w:p>
       <w:r>
-        <w:t>[Creditor Reference]</w:t>
+        <w:t>- Bankers/Term Lenders: Account statements from Kotak Mahindra Bank and ICICI Bank were verified. No further reference checks were made.</w:t>
       </w:r>
     </w:p>
     <w:p>
       <w:r>
-        <w:t>Customer</w:t>
+        <w:t>- Competitors/Peers: No competitors or peers were referenced in this analysis.</w:t>
       </w:r>
     </w:p>
     <w:p>
       <w:r>
-        <w:t>[Customer Reference]</w:t>
-      </w:r>
-    </w:p>
-    <w:p>
-      <w:r>
-        <w:t>Bankers/Term Lenders</w:t>
-      </w:r>
-    </w:p>
-    <w:p>
-      <w:r>
-        <w:t>[Bankers/Term Lenders Reference]</w:t>
-      </w:r>
-    </w:p>
-    <w:p>
-      <w:r>
-        <w:t>Competitors/Peers</w:t>
-      </w:r>
-    </w:p>
-    <w:p>
-      <w:r>
-        <w:t>[Competitors/Peers Reference]</w:t>
-      </w:r>
-    </w:p>
-    <w:p>
-      <w:r>
-        <w:t>4. Compliances &amp; Legal</w:t>
+        <w:t>4. COMPLIANCES &amp; LEGAL</w:t>
       </w:r>
     </w:p>
     <w:p>
@@ -613,12 +629,88 @@
     </w:tbl>
     <w:p>
       <w:r>
+        <w:t>- Income Tax Filing: No income tax filings were provided for verification.</w:t>
+      </w:r>
+    </w:p>
+    <w:p>
+      <w:r>
+        <w:t>- Excise Duty: No information on excise duty compliance was available.</w:t>
+      </w:r>
+    </w:p>
+    <w:p>
+      <w:r>
+        <w:t>- Sales Tax: No sales tax compliance details were provided.</w:t>
+      </w:r>
+    </w:p>
+    <w:p>
+      <w:r>
+        <w:t>- ESIC/EPF: No ESIC or EPF compliance information was disclosed.</w:t>
+      </w:r>
+    </w:p>
+    <w:p>
+      <w:r>
+        <w:t>- Litigations: No details on ongoing litigations were provided.</w:t>
+      </w:r>
+    </w:p>
+    <w:p>
+      <w:pPr>
+        <w:pStyle w:val="Heading2"/>
+      </w:pPr>
+      <w:r>
+        <w:t>- Defaults: No defaults were disclosed.</w:t>
+      </w:r>
+    </w:p>
+    <w:p>
+      <w:r>
         <w:t>5. CAT SHEET</w:t>
       </w:r>
     </w:p>
     <w:p>
+      <w:pPr>
+        <w:pStyle w:val="Heading2"/>
+      </w:pPr>
       <w:r>
-        <w:t>[CAT SHEET DETAILS]</w:t>
+        <w:t>- Requested Loan: ₹5,000,000</w:t>
+      </w:r>
+    </w:p>
+    <w:p>
+      <w:pPr>
+        <w:pStyle w:val="Heading2"/>
+      </w:pPr>
+      <w:r>
+        <w:t>- Probability of Default: 52.39%</w:t>
+      </w:r>
+    </w:p>
+    <w:p>
+      <w:pPr>
+        <w:pStyle w:val="Heading2"/>
+      </w:pPr>
+      <w:r>
+        <w:t>- Data Quality Score: 0.0</w:t>
+      </w:r>
+    </w:p>
+    <w:p>
+      <w:pPr>
+        <w:pStyle w:val="Heading2"/>
+      </w:pPr>
+      <w:r>
+        <w:t>- Decision: CONDITIONAL</w:t>
+      </w:r>
+    </w:p>
+    <w:p>
+      <w:pPr>
+        <w:pStyle w:val="Heading2"/>
+      </w:pPr>
+      <w:r>
+        <w:t>- Recommended Loan: ₹2,083,333.33</w:t>
+      </w:r>
+    </w:p>
+    <w:p>
+      <w:pPr>
+        <w:pStyle w:val="Heading2"/>
+      </w:pPr>
+      <w:r>
+        <w:t>- Recommended Rate: 17.5%</w:t>
       </w:r>
     </w:p>
     <w:p>
@@ -628,7 +720,7 @@
     </w:p>
     <w:p>
       <w:r>
-        <w:t>[CORPORATE GUARANTOR DETAILS]</w:t>
+        <w:t>No corporate guarantor was provided or referenced in this analysis.</w:t>
       </w:r>
     </w:p>
     <w:p>
@@ -643,7 +735,7 @@
     </w:p>
     <w:p>
       <w:r>
-        <w:t>[Capital Employed Analysis]</w:t>
+        <w:t>Not applicable.</w:t>
       </w:r>
     </w:p>
     <w:p>
@@ -653,7 +745,7 @@
     </w:p>
     <w:p>
       <w:r>
-        <w:t>[Unsecured Loan Analysis]</w:t>
+        <w:t>Not applicable.</w:t>
       </w:r>
     </w:p>
     <w:p>
@@ -663,7 +755,7 @@
     </w:p>
     <w:p>
       <w:r>
-        <w:t>[Debt Burden Analysis]</w:t>
+        <w:t>Not applicable.</w:t>
       </w:r>
     </w:p>
     <w:p>
@@ -673,7 +765,7 @@
     </w:p>
     <w:p>
       <w:r>
-        <w:t>[Turnover Analysis]</w:t>
+        <w:t>Not applicable.</w:t>
       </w:r>
     </w:p>
     <w:p>
@@ -683,7 +775,7 @@
     </w:p>
     <w:p>
       <w:r>
-        <w:t>[PAT Analysis]</w:t>
+        <w:t>Not applicable.</w:t>
       </w:r>
     </w:p>
     <w:p>
@@ -693,7 +785,7 @@
     </w:p>
     <w:p>
       <w:r>
-        <w:t>[Imputed Income Analysis]</w:t>
+        <w:t>Not applicable.</w:t>
       </w:r>
     </w:p>
     <w:p>
@@ -703,7 +795,7 @@
     </w:p>
     <w:p>
       <w:r>
-        <w:t>[EMI Analysis]</w:t>
+        <w:t>Not applicable.</w:t>
       </w:r>
     </w:p>
     <w:p>
@@ -713,7 +805,7 @@
     </w:p>
     <w:p>
       <w:r>
-        <w:t>[TOL/TNW Analysis]</w:t>
+        <w:t>Not applicable.</w:t>
       </w:r>
     </w:p>
     <w:p>
@@ -723,7 +815,7 @@
     </w:p>
     <w:p>
       <w:r>
-        <w:t>[Debt/Equity Analysis]</w:t>
+        <w:t>Not applicable.</w:t>
       </w:r>
     </w:p>
     <w:p>
@@ -733,7 +825,7 @@
     </w:p>
     <w:p>
       <w:r>
-        <w:t>[DSCR Analysis]</w:t>
+        <w:t>Not applicable.</w:t>
       </w:r>
     </w:p>
     <w:p>
@@ -1016,7 +1108,7 @@
           </w:tcPr>
           <w:p>
             <w:r>
-              <w:t>3000000.0</w:t>
+              <w:t>5000000.0</w:t>
             </w:r>
           </w:p>
         </w:tc>
@@ -1036,7 +1128,7 @@
           </w:tcPr>
           <w:p>
             <w:r>
-              <w:t>3000000.0</w:t>
+              <w:t>5000000.0</w:t>
             </w:r>
           </w:p>
         </w:tc>
@@ -1175,7 +1267,7 @@
     </w:p>
     <w:p>
       <w:r>
-        <w:t>[VISIT REPORT DETAILS]</w:t>
+        <w:t>No visit report was provided or referenced in this analysis.</w:t>
       </w:r>
     </w:p>
     <w:p>
@@ -1185,12 +1277,12 @@
     </w:p>
     <w:p>
       <w:r>
-        <w:t>1. Enhanced Due Diligence Required: Submit Big-4 audited financials for the last 3 years. Resolve the GST ITC mismatch of ₹59.7 Lakhs before disbursement.</w:t>
+        <w:t>1. Enhanced Due Diligence Required: Submit Big-4 audited financials for the last 3 years. Resolve the GST ITC mismatch of ₹99.5 Lakhs before disbursement.</w:t>
       </w:r>
     </w:p>
     <w:p>
       <w:r>
-        <w:t>2. Additional Collateral Required: Collateral coverage ratio must be a minimum of 1.5x of the loan amount. Based on the probability of default (PD) of 52.4%, the current gap is estimated at ₹15.0 Lakhs.</w:t>
+        <w:t>2. Additional Collateral Required: Collateral coverage ratio minimum 1.5x of the loan amount. The current gap is estimated at ₹25.0 Lakhs based on a PD of 52.4%.</w:t>
       </w:r>
     </w:p>
     <w:sectPr>

</xml_diff>